<commit_message>
Sopra HR : retour à l'identité Chef de projet SI, retouches légères vers le SI RH
Title Chef de projet SI | Applications métiers & SI RH, profil avec orientation
SIRH, BNP / La Poste du CV général + projet NOEMIE, Agile (notions) conservé,
interfaces SI RH au lieu de « SIRH ».

Co-Authored-By: Claude Opus 5.5 <noreply@anthropic.com>
Claude-Session: https://claude.ai/code/session_01Uwm2tAGtUGTnWWMUSVQkub
</commit_message>
<xml_diff>
--- a/output/CV_NicolasQiGUO_SopraHR.docx
+++ b/output/CV_NicolasQiGUO_SopraHR.docx
@@ -6,7 +6,7 @@
       <w:pPr>
         <w:keepNext w:val="0"/>
         <w:spacing w:before="0" w:after="0" w:line="240" w:lineRule="auto"/>
-        <w:ind w:left="0" w:right="3423"/>
+        <w:ind w:left="0" w:right="3973"/>
       </w:pPr>
       <w:r>
         <w:drawing>
@@ -60,14 +60,14 @@
           <w:sz w:val="23"/>
           <w:u w:val="none"/>
         </w:rPr>
-        <w:t>CONSULTANT SIRH | SI RH &amp; TRANSFORMATION DIGITALE</w:t>
+        <w:t>CHEF DE PROJET SI | APPLICATIONS MÉTIERS &amp; SI RH</w:t>
       </w:r>
     </w:p>
     <w:p>
       <w:pPr>
         <w:keepNext w:val="0"/>
         <w:spacing w:before="120" w:after="20" w:line="240" w:lineRule="auto"/>
-        <w:ind w:left="0" w:right="3423"/>
+        <w:ind w:left="0" w:right="3973"/>
       </w:pPr>
       <w:r>
         <w:rPr>
@@ -85,7 +85,7 @@
       <w:pPr>
         <w:keepNext w:val="0"/>
         <w:spacing w:before="0" w:after="0" w:line="240" w:lineRule="auto"/>
-        <w:ind w:left="0" w:right="3423"/>
+        <w:ind w:left="0" w:right="3973"/>
       </w:pPr>
       <w:r>
         <w:rPr>
@@ -103,7 +103,7 @@
       <w:pPr>
         <w:keepNext w:val="0"/>
         <w:spacing w:before="0" w:after="0" w:line="240" w:lineRule="auto"/>
-        <w:ind w:left="0" w:right="3423"/>
+        <w:ind w:left="0" w:right="3973"/>
       </w:pPr>
       <w:r>
         <w:rPr>
@@ -121,7 +121,7 @@
       <w:pPr>
         <w:keepNext w:val="0"/>
         <w:spacing w:before="140" w:after="0" w:line="240" w:lineRule="auto"/>
-        <w:ind w:left="0" w:right="3423"/>
+        <w:ind w:left="0" w:right="3973"/>
         <w:jc w:val="both"/>
       </w:pPr>
       <w:r>
@@ -144,7 +144,7 @@
           <w:sz w:val="19"/>
           <w:u w:val="none"/>
         </w:rPr>
-        <w:t>3 ans d'expérience en projets SI au sein de grands groupes (BNP Paribas, La Poste), dont des solutions s'appuyant sur le SI RH. Analyse des besoins, spécifications, recette, évolutions et corrections, en lien avec les métiers et les équipes techniques. Bases en low-code, programmation et bases de données.</w:t>
+        <w:t>3 ans d'expérience au sein de grands groupes (BNP Paribas, La Poste) en pilotage de projets SI de bout en bout, de l'analyse des besoins à la recette et au déploiement, avec une pratique du low-code et des flux de données SI RH. Souhaite mettre cette double compétence au service de projets SIRH.</w:t>
       </w:r>
     </w:p>
     <w:p>
@@ -303,7 +303,7 @@
           <w:sz w:val="19"/>
           <w:u w:val="none"/>
         </w:rPr>
-        <w:t xml:space="preserve">Qualification et priorisation des use cases IA &amp; RPA : </w:t>
+        <w:t xml:space="preserve">Structuration et coordination des initiatives IA &amp; RPA : </w:t>
       </w:r>
       <w:r>
         <w:rPr>
@@ -314,7 +314,7 @@
           <w:sz w:val="19"/>
           <w:u w:val="none"/>
         </w:rPr>
-        <w:t>conception du dispositif de collecte et de qualification ; 20+ use cases identifiés, 3 lancés en projet</w:t>
+        <w:t>conception et mise en place d'un dispositif de collecte, qualification et priorisation des use cases ; 20+ use cases identifiés, 3 lancés en projet</w:t>
       </w:r>
     </w:p>
     <w:p>
@@ -347,7 +347,7 @@
           <w:sz w:val="19"/>
           <w:u w:val="none"/>
         </w:rPr>
-        <w:t xml:space="preserve">Coordination de projets IA : </w:t>
+        <w:t xml:space="preserve">Pilotage et gouvernance des projets IA : </w:t>
       </w:r>
       <w:r>
         <w:rPr>
@@ -358,7 +358,7 @@
           <w:sz w:val="19"/>
           <w:u w:val="none"/>
         </w:rPr>
-        <w:t>recueil des besoins, coordination Métiers–IT, POC, organisation des recettes utilisateurs et accompagnement du déploiement (GenAI, RAG, Copilot)</w:t>
+        <w:t>recueil et formalisation des besoins, coordination transverse Métiers–IT, conduite de POC, accompagnement du déploiement de 3 solutions IA (GenAI, RAG, Copilot) et reporting auprès des instances de gouvernance</w:t>
       </w:r>
     </w:p>
     <w:p>
@@ -391,7 +391,7 @@
           <w:sz w:val="19"/>
           <w:u w:val="none"/>
         </w:rPr>
-        <w:t xml:space="preserve">Conduite du changement : </w:t>
+        <w:t xml:space="preserve">Conduite du changement </w:t>
       </w:r>
       <w:r>
         <w:rPr>
@@ -402,7 +402,7 @@
           <w:sz w:val="19"/>
           <w:u w:val="none"/>
         </w:rPr>
-        <w:t>programme IA transverse (5 000+ collaborateurs), animation de 70+ ambassadeurs IA</w:t>
+        <w:t>dans le cadre du déploiement d'un programme IA transverse à grande échelle (5 000+ collaborateurs) : animation d'un réseau de 70+ ambassadeurs IA, sessions d'onboarding et d'acculturation, événements communautaires</w:t>
       </w:r>
     </w:p>
     <w:p>
@@ -558,7 +558,7 @@
           <w:sz w:val="19"/>
           <w:u w:val="none"/>
         </w:rPr>
-        <w:t>Analyse des besoins métiers (Finance, RH), cahiers des charges et spécifications fonctionnelles</w:t>
+        <w:t>Recueil et analyse des besoins métiers, rédaction des cahiers des charges et spécifications fonctionnelles et techniques</w:t>
       </w:r>
     </w:p>
     <w:p>
@@ -591,7 +591,7 @@
           <w:sz w:val="19"/>
           <w:u w:val="none"/>
         </w:rPr>
-        <w:t>Développement low-code (Power Apps, Power Automate, SharePoint) et coordination Métiers–IT</w:t>
+        <w:t>Coordination Métiers–IT pour la coconception des solutions</w:t>
       </w:r>
     </w:p>
     <w:p>
@@ -624,7 +624,40 @@
           <w:sz w:val="19"/>
           <w:u w:val="none"/>
         </w:rPr>
-        <w:t>Stratégie et cahiers de recette, tests, suivi des anomalies et validation</w:t>
+        <w:t>Pilotage du développement, de la recette et de la mise en production</w:t>
+      </w:r>
+    </w:p>
+    <w:p>
+      <w:pPr>
+        <w:keepNext w:val="0"/>
+        <w:tabs>
+          <w:tab w:pos="2381" w:val="left"/>
+        </w:tabs>
+        <w:spacing w:before="0" w:after="0" w:line="240" w:lineRule="auto"/>
+        <w:ind w:left="2381" w:hanging="227"/>
+      </w:pPr>
+      <w:r>
+        <w:rPr>
+          <w:rFonts w:ascii="Times New Roman" w:hAnsi="Times New Roman" w:eastAsia="Times New Roman"/>
+          <w:b w:val="0"/>
+          <w:i w:val="0"/>
+          <w:color w:val="000000"/>
+          <w:sz w:val="15"/>
+          <w:u w:val="none"/>
+        </w:rPr>
+        <w:t>▪</w:t>
+        <w:tab/>
+      </w:r>
+      <w:r>
+        <w:rPr>
+          <w:rFonts w:ascii="Times New Roman" w:hAnsi="Times New Roman" w:eastAsia="Times New Roman"/>
+          <w:b w:val="0"/>
+          <w:i w:val="0"/>
+          <w:color w:val="000000"/>
+          <w:sz w:val="19"/>
+          <w:u w:val="none"/>
+        </w:rPr>
+        <w:t>Gestion des risques et animation des instances projets (COSUI, COPIL)</w:t>
       </w:r>
     </w:p>
     <w:p>
@@ -657,7 +690,7 @@
           <w:sz w:val="19"/>
           <w:u w:val="none"/>
         </w:rPr>
-        <w:t>Mise en production, accompagnement du déploiement et documentation utilisateurs (Finance, RH)</w:t>
+        <w:t>Accompagnement du déploiement auprès des fonctions Finance et RH</w:t>
       </w:r>
     </w:p>
     <w:p>
@@ -767,7 +800,40 @@
           <w:sz w:val="19"/>
           <w:u w:val="none"/>
         </w:rPr>
-        <w:t>Monitoring d'une dizaine de robots en production, gestion des incidents et support fonctionnel</w:t>
+        <w:t>Monitoring quotidien d'une dizaine de robots en production et gestion des incidents</w:t>
+      </w:r>
+    </w:p>
+    <w:p>
+      <w:pPr>
+        <w:keepNext w:val="0"/>
+        <w:tabs>
+          <w:tab w:pos="2381" w:val="left"/>
+        </w:tabs>
+        <w:spacing w:before="0" w:after="0" w:line="240" w:lineRule="auto"/>
+        <w:ind w:left="2381" w:hanging="227"/>
+      </w:pPr>
+      <w:r>
+        <w:rPr>
+          <w:rFonts w:ascii="Times New Roman" w:hAnsi="Times New Roman" w:eastAsia="Times New Roman"/>
+          <w:b w:val="0"/>
+          <w:i w:val="0"/>
+          <w:color w:val="000000"/>
+          <w:sz w:val="15"/>
+          <w:u w:val="none"/>
+        </w:rPr>
+        <w:t>▪</w:t>
+        <w:tab/>
+      </w:r>
+      <w:r>
+        <w:rPr>
+          <w:rFonts w:ascii="Times New Roman" w:hAnsi="Times New Roman" w:eastAsia="Times New Roman"/>
+          <w:b w:val="0"/>
+          <w:i w:val="0"/>
+          <w:color w:val="000000"/>
+          <w:sz w:val="19"/>
+          <w:u w:val="none"/>
+        </w:rPr>
+        <w:t>Suivi de la performance des solutions déployées (ROI, fiabilité, adoption)</w:t>
       </w:r>
     </w:p>
     <w:p>
@@ -800,7 +866,7 @@
           <w:sz w:val="19"/>
           <w:u w:val="none"/>
         </w:rPr>
-        <w:t>Suivi des corrections et évolutions avec la TMA / les prestataires, amélioration continue</w:t>
+        <w:t>Identification et mise en œuvre d'axes d'amélioration continue</w:t>
       </w:r>
     </w:p>
     <w:p>
@@ -874,7 +940,7 @@
     <w:p>
       <w:pPr>
         <w:keepNext w:val="0"/>
-        <w:spacing w:before="200" w:after="160" w:line="24" w:lineRule="auto"/>
+        <w:spacing w:before="120" w:after="100" w:line="24" w:lineRule="auto"/>
         <w:ind w:right="8391"/>
         <w:pBdr>
           <w:bottom w:val="single" w:sz="4" w:space="1" w:color="A6A6A6"/>
@@ -1148,7 +1214,7 @@
     <w:p>
       <w:pPr>
         <w:keepNext w:val="0"/>
-        <w:spacing w:before="200" w:after="160" w:line="24" w:lineRule="auto"/>
+        <w:spacing w:before="120" w:after="100" w:line="24" w:lineRule="auto"/>
         <w:ind w:right="8391"/>
         <w:pBdr>
           <w:bottom w:val="single" w:sz="4" w:space="1" w:color="A6A6A6"/>
@@ -1206,61 +1272,6 @@
           <w:sz w:val="19"/>
           <w:u w:val="none"/>
         </w:rPr>
-        <w:t>Analyse &amp; recette :</w:t>
-      </w:r>
-      <w:r>
-        <w:rPr>
-          <w:rFonts w:ascii="Times New Roman" w:hAnsi="Times New Roman" w:eastAsia="Times New Roman"/>
-          <w:b w:val="0"/>
-          <w:i w:val="0"/>
-          <w:color w:val="000000"/>
-          <w:sz w:val="19"/>
-          <w:u w:val="none"/>
-        </w:rPr>
-        <w:tab/>
-        <w:t>Recueil des besoins, spécifications, cahiers de recette, tests, gestion des anomalies</w:t>
-      </w:r>
-    </w:p>
-    <w:p>
-      <w:pPr>
-        <w:keepNext w:val="0"/>
-        <w:tabs>
-          <w:tab w:pos="1814" w:val="left"/>
-          <w:tab w:pos="3685" w:val="left"/>
-        </w:tabs>
-        <w:spacing w:before="0" w:after="40" w:line="240" w:lineRule="auto"/>
-        <w:ind w:left="3685" w:hanging="3685"/>
-      </w:pPr>
-      <w:r>
-        <w:rPr>
-          <w:rFonts w:ascii="Times New Roman" w:hAnsi="Times New Roman" w:eastAsia="Times New Roman"/>
-          <w:b w:val="0"/>
-          <w:i w:val="0"/>
-          <w:color w:val="000000"/>
-          <w:sz w:val="19"/>
-          <w:u w:val="none"/>
-        </w:rPr>
-      </w:r>
-      <w:r>
-        <w:rPr>
-          <w:rFonts w:ascii="Times New Roman" w:hAnsi="Times New Roman" w:eastAsia="Times New Roman"/>
-          <w:b w:val="0"/>
-          <w:i w:val="0"/>
-          <w:color w:val="000000"/>
-          <w:sz w:val="19"/>
-          <w:u w:val="none"/>
-        </w:rPr>
-        <w:tab/>
-      </w:r>
-      <w:r>
-        <w:rPr>
-          <w:rFonts w:ascii="Times New Roman" w:hAnsi="Times New Roman" w:eastAsia="Times New Roman"/>
-          <w:b/>
-          <w:i w:val="0"/>
-          <w:color w:val="000000"/>
-          <w:sz w:val="19"/>
-          <w:u w:val="none"/>
-        </w:rPr>
         <w:t>Gestion de projet :</w:t>
       </w:r>
       <w:r>
@@ -1273,7 +1284,9 @@
           <w:u w:val="none"/>
         </w:rPr>
         <w:tab/>
-        <w:t>Planning, COPIL / COSUI, risques, documentation – Cycle en V, hybride</w:t>
+        <w:t>Cadrage, recueil des besoins, spécifications, recette, mise en production</w:t>
+        <w:br/>
+        <w:t>Gouvernance (COPIL / COSUI), risques – Cycle en V, hybride, Agile (notions)</w:t>
       </w:r>
     </w:p>
     <w:p>
@@ -1328,7 +1341,62 @@
           <w:u w:val="none"/>
         </w:rPr>
         <w:tab/>
-        <w:t>SIRH (flux de données RH), SI Finance, SAP, Power Platform, SharePoint</w:t>
+        <w:t>SI Finance, interfaces SI RH, SAP, intégration applicative, gouvernance des SI</w:t>
+      </w:r>
+    </w:p>
+    <w:p>
+      <w:pPr>
+        <w:keepNext w:val="0"/>
+        <w:tabs>
+          <w:tab w:pos="1814" w:val="left"/>
+          <w:tab w:pos="3685" w:val="left"/>
+        </w:tabs>
+        <w:spacing w:before="0" w:after="40" w:line="240" w:lineRule="auto"/>
+        <w:ind w:left="3685" w:hanging="3685"/>
+      </w:pPr>
+      <w:r>
+        <w:rPr>
+          <w:rFonts w:ascii="Times New Roman" w:hAnsi="Times New Roman" w:eastAsia="Times New Roman"/>
+          <w:b w:val="0"/>
+          <w:i w:val="0"/>
+          <w:color w:val="000000"/>
+          <w:sz w:val="19"/>
+          <w:u w:val="none"/>
+        </w:rPr>
+      </w:r>
+      <w:r>
+        <w:rPr>
+          <w:rFonts w:ascii="Times New Roman" w:hAnsi="Times New Roman" w:eastAsia="Times New Roman"/>
+          <w:b w:val="0"/>
+          <w:i w:val="0"/>
+          <w:color w:val="000000"/>
+          <w:sz w:val="19"/>
+          <w:u w:val="none"/>
+        </w:rPr>
+        <w:tab/>
+      </w:r>
+      <w:r>
+        <w:rPr>
+          <w:rFonts w:ascii="Times New Roman" w:hAnsi="Times New Roman" w:eastAsia="Times New Roman"/>
+          <w:b/>
+          <w:i w:val="0"/>
+          <w:color w:val="000000"/>
+          <w:sz w:val="19"/>
+          <w:u w:val="none"/>
+        </w:rPr>
+        <w:t>Outils digitaux :</w:t>
+      </w:r>
+      <w:r>
+        <w:rPr>
+          <w:rFonts w:ascii="Times New Roman" w:hAnsi="Times New Roman" w:eastAsia="Times New Roman"/>
+          <w:b w:val="0"/>
+          <w:i w:val="0"/>
+          <w:color w:val="000000"/>
+          <w:sz w:val="19"/>
+          <w:u w:val="none"/>
+        </w:rPr>
+        <w:tab/>
+        <w:t>Power Apps, Power Automate, Power BI, SharePoint</w:t>
       </w:r>
     </w:p>
     <w:p>
@@ -1389,7 +1457,7 @@
     <w:p>
       <w:pPr>
         <w:keepNext w:val="0"/>
-        <w:spacing w:before="200" w:after="160" w:line="24" w:lineRule="auto"/>
+        <w:spacing w:before="120" w:after="100" w:line="24" w:lineRule="auto"/>
         <w:ind w:right="8391"/>
         <w:pBdr>
           <w:bottom w:val="single" w:sz="4" w:space="1" w:color="A6A6A6"/>
@@ -1575,7 +1643,7 @@
     <w:p>
       <w:pPr>
         <w:keepNext w:val="0"/>
-        <w:spacing w:before="200" w:after="160" w:line="24" w:lineRule="auto"/>
+        <w:spacing w:before="120" w:after="100" w:line="24" w:lineRule="auto"/>
         <w:ind w:right="8391"/>
         <w:pBdr>
           <w:bottom w:val="single" w:sz="4" w:space="1" w:color="A6A6A6"/>

</xml_diff>